<commit_message>
Added files related to Paper
</commit_message>
<xml_diff>
--- a/SALES-INSIGHTS-PROJECT/Research papers/IJSREM-Manuscript.docx
+++ b/SALES-INSIGHTS-PROJECT/Research papers/IJSREM-Manuscript.docx
@@ -138,32 +138,6 @@
       <w:r>
         <w:rPr>
           <w:rFonts w:ascii="Times New Roman" w:hAnsi="Times New Roman"/>
-        </w:rPr>
-        <w:t xml:space="preserve"> </w:t>
-      </w:r>
-      <w:r>
-        <w:rPr>
-          <w:rFonts w:ascii="Times New Roman" w:eastAsia="Times New Roman" w:hAnsi="Times New Roman"/>
-          <w:color w:val="000000"/>
-          <w:sz w:val="20"/>
-          <w:szCs w:val="20"/>
-          <w:lang w:val="en-GB"/>
-        </w:rPr>
-        <w:t>This</w:t>
-      </w:r>
-      <w:r>
-        <w:rPr>
-          <w:rFonts w:ascii="Times New Roman" w:eastAsia="Times New Roman" w:hAnsi="Times New Roman"/>
-          <w:color w:val="000000"/>
-          <w:sz w:val="20"/>
-          <w:szCs w:val="20"/>
-          <w:lang w:val="en-GB"/>
-        </w:rPr>
-        <w:t xml:space="preserve"> </w:t>
-      </w:r>
-      <w:r>
-        <w:rPr>
-          <w:rFonts w:ascii="Times New Roman" w:hAnsi="Times New Roman"/>
           <w:color w:val="000000"/>
           <w:sz w:val="20"/>
           <w:szCs w:val="20"/>
@@ -342,10 +316,10 @@
         <w:pStyle w:val="BodyText"/>
       </w:pPr>
       <w:r>
-        <w:t xml:space="preserve">AtliQ Hardware, an India-based supplier of computer hardware and peripherals, operates through multiple regional </w:t>
-      </w:r>
-      <w:r>
-        <w:t>offices with its head office located in Delhi. The company supplies products to various clients across India, including retail chains like Surge Stores and Nomad Stores. Despite its wide distribution network, AtliQ Hardware’s sales performance monitoring was limited to verbal communication between the sales director and regional managers. This approach resulted in inconsistent reporting, lack of transparency, and an incomplete view of regional sales trends. The absence of a centralized, data-backed reporting system made it difficult for the sales director to identify problem areas and make informed decisions—especially as overall sales began to decline.</w:t>
+        <w:t xml:space="preserve">AtliQ Hardware, an India-based supplier of computer hardware and peripherals, operates through multiple regional offices with its head office located in Delhi. The company </w:t>
+      </w:r>
+      <w:r>
+        <w:t>supplies products to various clients across India, including retail chains like Surge Stores and Nomad Stores. Despite its wide distribution network, AtliQ Hardware’s sales performance monitoring was limited to verbal communication between the sales director and regional managers. This approach resulted in inconsistent reporting, lack of transparency, and an incomplete view of regional sales trends. The absence of a centralized, data-backed reporting system made it difficult for the sales director to identify problem areas and make informed decisions—especially as overall sales began to decline.</w:t>
       </w:r>
     </w:p>
     <w:p>
@@ -474,17 +448,20 @@
         <w:ind w:firstLine="0"/>
       </w:pPr>
       <w:r>
+        <w:t xml:space="preserve">[1]. </w:t>
+      </w:r>
+      <w:r>
+        <w:t>Th</w:t>
+      </w:r>
+      <w:r>
+        <w:t>is</w:t>
+      </w:r>
+      <w:r>
+        <w:t xml:space="preserve"> paper concentrated on sales insights for a hardware supply firm, emphasizing the importance of power BI in </w:t>
+      </w:r>
+      <w:r>
         <w:lastRenderedPageBreak/>
-        <w:t xml:space="preserve">[1]. </w:t>
-      </w:r>
-      <w:r>
-        <w:t>Th</w:t>
-      </w:r>
-      <w:r>
-        <w:t>is</w:t>
-      </w:r>
-      <w:r>
-        <w:t xml:space="preserve"> paper concentrated on sales insights for a hardware supply firm, emphasizing the importance of power BI in enterprise environments. They noted how the simplicity of the tool and the ability to visualize the data in real time were central to creating actionable insights. Using an organized ETL process with SQL for extraction, Power Query for transformation, and DAX for modeling, they were able to enable better strategic decision-making. Even though Tableau was not used in their analysis, the study highlighted how power BI efficienlty handles large volumes of data and assists buisinesses in making timely data-driven decisions.</w:t>
+        <w:t>enterprise environments. They noted how the simplicity of the tool and the ability to visualize the data in real time were central to creating actionable insights. Using an organized ETL process with SQL for extraction, Power Query for transformation, and DAX for modeling, they were able to enable better strategic decision-making. Even though Tableau was not used in their analysis, the study highlighted how power BI efficienlty handles large volumes of data and assists buisinesses in making timely data-driven decisions.</w:t>
       </w:r>
     </w:p>
     <w:p>
@@ -663,7 +640,7 @@
           <w:sz w:val="20"/>
           <w:szCs w:val="20"/>
         </w:rPr>
-        <w:t xml:space="preserve">Banerjee, Das, and Nath (2024) examined how Power BI facilitates business intelligence and strategic planning through its data visualization capabilities. Their research demonstrated how well-organized and clean datasets in Power BI result in real-time insights that aid decision-making across business </w:t>
+        <w:t xml:space="preserve">Banerjee, Das, and Nath (2024) examined how Power BI facilitates business intelligence and strategic planning through its data visualization capabilities. Their research demonstrated how well-organized and clean datasets in Power BI result in real-time insights that aid decision-making across business functions. They pointed to the employment of calculated columns and DAX formulas in deriving greater insights from </w:t>
       </w:r>
       <w:r>
         <w:rPr>
@@ -672,7 +649,7 @@
           <w:sz w:val="20"/>
           <w:szCs w:val="20"/>
         </w:rPr>
-        <w:t>functions. They pointed to the employment of calculated columns and DAX formulas in deriving greater insights from large sets of data, illustrating how interactive dashboards might monitor KPIs and improve business team collaboration. The study further pointed out that bringing together Power BI and external data sources delivered a single business view of operations, enhancing forecasting and alignment.</w:t>
+        <w:t>large sets of data, illustrating how interactive dashboards might monitor KPIs and improve business team collaboration. The study further pointed out that bringing together Power BI and external data sources delivered a single business view of operations, enhancing forecasting and alignment.</w:t>
       </w:r>
     </w:p>
     <w:p>

</xml_diff>